<commit_message>
docs: update architecture, knowledge base, and postman collection through Phase 8
Sync all project documentation with completed Improvement Phases 5-8:
- Architecture.md: sprint timeline, shared lib description, tech stack, improvement status
- KnowledgeBase.md/.docx: phase table, shared lib TypeScript table, test counts, quick reference
- Postman collection: add GET /api/rag/stream SSE endpoint, GET /api/documents endpoints

Co-Authored-By: Claude Opus 4.6 <noreply@anthropic.com>
</commit_message>
<xml_diff>
--- a/ArNir/docs/ArNir_KnowledgeBase.docx
+++ b/ArNir/docs/ArNir_KnowledgeBase.docx
@@ -166,17 +166,17 @@
           </w:tcPr>
           <w:p>
             <w:r>
-              <w:t xml:space="preserve">Pending</w:t>
-            </w:r>
-          </w:p>
-        </w:tc>
-        <w:tc>
-          <w:tcPr>
-            <w:tcW w:type="pct" w:w="33%"/>
-          </w:tcPr>
-          <w:p>
-            <w:r>
-              <w:t xml:space="preserve">Healthcare domain features</w:t>
+              <w:t xml:space="preserve">Complete and verified</w:t>
+            </w:r>
+          </w:p>
+        </w:tc>
+        <w:tc>
+          <w:tcPr>
+            <w:tcW w:type="pct" w:w="33%"/>
+          </w:tcPr>
+          <w:p>
+            <w:r>
+              <w:t xml:space="preserve">Multi-document healthcare chat, medical term highlighting, jsPDF export, inline source document panel/viewer</w:t>
             </w:r>
           </w:p>
         </w:tc>
@@ -198,17 +198,17 @@
           </w:tcPr>
           <w:p>
             <w:r>
-              <w:t xml:space="preserve">Pending</w:t>
-            </w:r>
-          </w:p>
-        </w:tc>
-        <w:tc>
-          <w:tcPr>
-            <w:tcW w:type="pct" w:w="33%"/>
-          </w:tcPr>
-          <w:p>
-            <w:r>
-              <w:t xml:space="preserve">Ecommerce domain features</w:t>
+              <w:t xml:space="preserve">Complete and verified</w:t>
+            </w:r>
+          </w:p>
+        </w:tc>
+        <w:tc>
+          <w:tcPr>
+            <w:tcW w:type="pct" w:w="33%"/>
+          </w:tcPr>
+          <w:p>
+            <w:r>
+              <w:t xml:space="preserve">Product comparison, budget filters, cart/wishlist, image metadata rendering, facet-filtered recommendations</w:t>
             </w:r>
           </w:p>
         </w:tc>
@@ -230,17 +230,17 @@
           </w:tcPr>
           <w:p>
             <w:r>
-              <w:t xml:space="preserve">Pending</w:t>
-            </w:r>
-          </w:p>
-        </w:tc>
-        <w:tc>
-          <w:tcPr>
-            <w:tcW w:type="pct" w:w="33%"/>
-          </w:tcPr>
-          <w:p>
-            <w:r>
-              <w:t xml:space="preserve">Finance domain features</w:t>
+              <w:t xml:space="preserve">Complete and verified</w:t>
+            </w:r>
+          </w:p>
+        </w:tc>
+        <w:tc>
+          <w:tcPr>
+            <w:tcW w:type="pct" w:w="33%"/>
+          </w:tcPr>
+          <w:p>
+            <w:r>
+              <w:t xml:space="preserve">Recharts finance chart, markdown DataTable, weighted risk score/gauge, compare mode, PDF/XLSX export</w:t>
             </w:r>
           </w:p>
         </w:tc>
@@ -262,17 +262,17 @@
           </w:tcPr>
           <w:p>
             <w:r>
-              <w:t xml:space="preserve">Pending</w:t>
-            </w:r>
-          </w:p>
-        </w:tc>
-        <w:tc>
-          <w:tcPr>
-            <w:tcW w:type="pct" w:w="33%"/>
-          </w:tcPr>
-          <w:p>
-            <w:r>
-              <w:t xml:space="preserve">Docker + infrastructure improvements</w:t>
+              <w:t xml:space="preserve">Complete in source, verified for tests/builds/E2E</w:t>
+            </w:r>
+          </w:p>
+        </w:tc>
+        <w:tc>
+          <w:tcPr>
+            <w:tcW w:type="pct" w:w="33%"/>
+          </w:tcPr>
+          <w:p>
+            <w:r>
+              <w:t xml:space="preserve">Runtime API env-config injection, demo healthchecks, nginx caching, .dockerignore, CI workflow, Playwright smoke tests</w:t>
             </w:r>
           </w:p>
         </w:tc>
@@ -294,17 +294,17 @@
           </w:tcPr>
           <w:p>
             <w:r>
-              <w:t xml:space="preserve">Pending</w:t>
-            </w:r>
-          </w:p>
-        </w:tc>
-        <w:tc>
-          <w:tcPr>
-            <w:tcW w:type="pct" w:w="33%"/>
-          </w:tcPr>
-          <w:p>
-            <w:r>
-              <w:t xml:space="preserve">Streaming + analytics</w:t>
+              <w:t xml:space="preserve">Complete</w:t>
+            </w:r>
+          </w:p>
+        </w:tc>
+        <w:tc>
+          <w:tcPr>
+            <w:tcW w:type="pct" w:w="33%"/>
+          </w:tcPr>
+          <w:p>
+            <w:r>
+              <w:t xml:space="preserve">SSE streaming endpoint (GET /api/rag/stream), useChatStream hook, ragStream client, AnalyticsProvider + tracker</w:t>
             </w:r>
           </w:p>
         </w:tc>
@@ -326,17 +326,17 @@
           </w:tcPr>
           <w:p>
             <w:r>
-              <w:t xml:space="preserve">Pending</w:t>
-            </w:r>
-          </w:p>
-        </w:tc>
-        <w:tc>
-          <w:tcPr>
-            <w:tcW w:type="pct" w:w="33%"/>
-          </w:tcPr>
-          <w:p>
-            <w:r>
-              <w:t xml:space="preserve">TypeScript migration</w:t>
+              <w:t xml:space="preserve">Complete and verified</w:t>
+            </w:r>
+          </w:p>
+        </w:tc>
+        <w:tc>
+          <w:tcPr>
+            <w:tcW w:type="pct" w:w="33%"/>
+          </w:tcPr>
+          <w:p>
+            <w:r>
+              <w:t xml:space="preserve">Strict TypeScript for @arnir/shared. 56 files renamed .js/.jsx to .ts/.tsx. types/index.ts (20+ interfaces). tsc --noEmit 0 errors</w:t>
             </w:r>
           </w:p>
         </w:tc>
@@ -352,27 +352,27 @@
     </w:p>
     <w:p>
       <w:r>
-        <w:t xml:space="preserve">Shared tests: 31/31</w:t>
-      </w:r>
-    </w:p>
-    <w:p>
-      <w:r>
-        <w:t xml:space="preserve">Healthcare demo tests: 12/12</w:t>
-      </w:r>
-    </w:p>
-    <w:p>
-      <w:r>
-        <w:t xml:space="preserve">Ecommerce demo tests: 8/8</w:t>
-      </w:r>
-    </w:p>
-    <w:p>
-      <w:r>
-        <w:t xml:space="preserve">Finance demo tests: 10/10</w:t>
-      </w:r>
-    </w:p>
-    <w:p>
-      <w:r>
-        <w:t xml:space="preserve">Builds verified: @arnir/shared, healthcare-demo, ecommerce-demo, finance-demo</w:t>
+        <w:t xml:space="preserve">Shared tests: 37/37</w:t>
+      </w:r>
+    </w:p>
+    <w:p>
+      <w:r>
+        <w:t xml:space="preserve">Healthcare demo tests: 13/13</w:t>
+      </w:r>
+    </w:p>
+    <w:p>
+      <w:r>
+        <w:t xml:space="preserve">Ecommerce demo tests: 9/9</w:t>
+      </w:r>
+    </w:p>
+    <w:p>
+      <w:r>
+        <w:t xml:space="preserve">Finance demo tests: 13/13</w:t>
+      </w:r>
+    </w:p>
+    <w:p>
+      <w:r>
+        <w:t xml:space="preserve">Builds verified: @arnir/shared, healthcare-demo, ecommerce-demo, finance-demo. Playwright 6/6. tsc --noEmit 0 errors</w:t>
       </w:r>
     </w:p>
     <w:p>
@@ -398,7 +398,7 @@
     </w:p>
     <w:p>
       <w:r>
-        <w:t xml:space="preserve">Backend build status remains 0 errors with 72/72 unit tests passing, alongside the previously completed Sprints 1-8, Docker setup, and demo frontend integration.</w:t>
+        <w:t xml:space="preserve">Backend build status remains 0 errors with 72/72 unit tests passing. All 8 sprints complete. All 8 improvement phases complete (Foundation, Accessibility, Healthcare, Ecommerce, Finance, Docker/Infra, Streaming/Analytics, TypeScript). @arnir/shared is now fully typed TypeScript with strict mode.</w:t>
       </w:r>
     </w:p>
     <w:sectPr>

</xml_diff>